<commit_message>
Added Fill Out Form Links
</commit_message>
<xml_diff>
--- a/Task3a_Gathering_Feedback_Plan_LL-000020908_Ram_D.docx
+++ b/Task3a_Gathering_Feedback_Plan_LL-000020908_Ram_D.docx
@@ -343,8 +343,19 @@
       </w:r>
     </w:p>
     <w:p>
-      <w:r>
-        <w:t>Questionnaire:</w:t>
+      <w:pPr>
+        <w:rPr>
+          <w:rStyle w:val="Hyperlink"/>
+        </w:rPr>
+      </w:pPr>
+      <w:r>
+        <w:t>Questionnaire</w:t>
+      </w:r>
+      <w:r>
+        <w:t xml:space="preserve"> - Edit</w:t>
+      </w:r>
+      <w:r>
+        <w:t>:</w:t>
       </w:r>
       <w:r>
         <w:t xml:space="preserve"> </w:t>
@@ -360,12 +371,49 @@
     </w:p>
     <w:p>
       <w:r>
-        <w:t>Paired coding review:</w:t>
+        <w:rPr>
+          <w:rStyle w:val="Hyperlink"/>
+          <w:color w:val="000000" w:themeColor="text1"/>
+          <w:u w:val="none"/>
+        </w:rPr>
+        <w:t>Questionnaire</w:t>
+      </w:r>
+      <w:r>
+        <w:rPr>
+          <w:rStyle w:val="Hyperlink"/>
+          <w:color w:val="000000" w:themeColor="text1"/>
+          <w:u w:val="none"/>
+        </w:rPr>
+        <w:t xml:space="preserve"> – Fill out: </w:t>
+      </w:r>
+      <w:hyperlink r:id="rId7" w:history="1">
+        <w:r>
+          <w:rPr>
+            <w:rStyle w:val="Hyperlink"/>
+          </w:rPr>
+          <w:t>Greenfield Local Hub Website Prototype Feedback – Fill out form</w:t>
+        </w:r>
+      </w:hyperlink>
+    </w:p>
+    <w:p>
+      <w:pPr>
+        <w:rPr>
+          <w:rStyle w:val="Hyperlink"/>
+        </w:rPr>
+      </w:pPr>
+      <w:r>
+        <w:t>Paired coding review</w:t>
+      </w:r>
+      <w:r>
+        <w:t xml:space="preserve"> - edit</w:t>
+      </w:r>
+      <w:r>
+        <w:t>:</w:t>
       </w:r>
       <w:r>
         <w:t xml:space="preserve"> </w:t>
       </w:r>
-      <w:hyperlink r:id="rId7" w:history="1">
+      <w:hyperlink r:id="rId8" w:history="1">
         <w:r>
           <w:rPr>
             <w:rStyle w:val="Hyperlink"/>
@@ -374,6 +422,35 @@
         </w:r>
       </w:hyperlink>
     </w:p>
+    <w:p>
+      <w:r>
+        <w:t xml:space="preserve">Paired coding review </w:t>
+      </w:r>
+      <w:r>
+        <w:t>–</w:t>
+      </w:r>
+      <w:r>
+        <w:t xml:space="preserve"> </w:t>
+      </w:r>
+      <w:r>
+        <w:t>Fill out</w:t>
+      </w:r>
+      <w:r>
+        <w:t>:</w:t>
+      </w:r>
+      <w:r>
+        <w:t xml:space="preserve"> </w:t>
+      </w:r>
+      <w:hyperlink r:id="rId9" w:history="1">
+        <w:r>
+          <w:rPr>
+            <w:rStyle w:val="Hyperlink"/>
+          </w:rPr>
+          <w:t>Greenfield Local Hub Website Paired-Coding Review – Fill out form</w:t>
+        </w:r>
+      </w:hyperlink>
+    </w:p>
+    <w:p/>
     <w:sectPr>
       <w:pgSz w:w="11906" w:h="16838"/>
       <w:pgMar w:top="1440" w:right="1440" w:bottom="1440" w:left="1440" w:header="708" w:footer="708" w:gutter="0"/>
@@ -1061,6 +1138,7 @@
     <w:rsid w:val="00B65FF6"/>
     <w:rsid w:val="00BE0001"/>
     <w:rsid w:val="00E1294D"/>
+    <w:rsid w:val="00EF1A2B"/>
   </w:rsids>
   <m:mathPr>
     <m:mathFont m:val="Cambria Math"/>

</xml_diff>